<commit_message>
Remove abstract citation, renumber references 1-3 in order of first mention, italicize reference titles
Co-Authored-By: Claude Opus 5.5 <noreply@anthropic.com>
Claude-Session: https://claude.ai/code/session_01VkRRDHxfMApHVBQgQibkFd
</commit_message>
<xml_diff>
--- a/PMDD_Scoping_Review/PMDD_Poster_References_AMA.docx
+++ b/PMDD_Scoping_Review/PMDD_Poster_References_AMA.docx
@@ -41,16 +41,17 @@
         <w:tab/>
       </w:r>
       <w:r>
-        <w:t xml:space="preserve">Reilly TJ, Patel S, Unachukwu IC, et al. The prevalence of premenstrual dysphoric disorder: systematic review and meta-analysis. </w:t>
+        <w:t xml:space="preserve">American Psychiatric Association. </w:t>
       </w:r>
       <w:r>
         <w:rPr>
           <w:i/>
         </w:rPr>
-        <w:t>J Affect Disord</w:t>
+        <w:t>Diagnostic and Statistical Manual of Mental Disorders</w:t>
       </w:r>
       <w:r>
-        <w:t>. 2024;349:534-540. doi:10.1016/j.jad.2024.01.066</w:t>
+        <w:rPr/>
+        <w:t>. 5th ed. American Psychiatric Association; 2013. doi:10.1176/appi.books.9780890425596</w:t>
       </w:r>
     </w:p>
     <w:p>
@@ -63,7 +64,17 @@
         <w:tab/>
       </w:r>
       <w:r>
-        <w:t>American Psychiatric Association. Diagnostic and Statistical Manual of Mental Disorders. 5th ed. American Psychiatric Association; 2013. doi:10.1176/appi.books.9780890425596</w:t>
+        <w:t xml:space="preserve">World Health Organization. </w:t>
+      </w:r>
+      <w:r>
+        <w:rPr>
+          <w:i/>
+        </w:rPr>
+        <w:t>International Classification of Diseases, 11th Revision (ICD-11)</w:t>
+      </w:r>
+      <w:r>
+        <w:rPr/>
+        <w:t>. World Health Organization; 2022. Accessed September 30, 2026. https://icd.who.int/</w:t>
       </w:r>
     </w:p>
     <w:p>
@@ -76,7 +87,16 @@
         <w:tab/>
       </w:r>
       <w:r>
-        <w:t>World Health Organization. International Classification of Diseases, 11th Revision (ICD-11). World Health Organization; 2022. Accessed September 30, 2026. https://icd.who.int/</w:t>
+        <w:t xml:space="preserve">Reilly TJ, Patel S, Unachukwu IC, et al. The prevalence of premenstrual dysphoric disorder: systematic review and meta-analysis. </w:t>
+      </w:r>
+      <w:r>
+        <w:rPr>
+          <w:i/>
+        </w:rPr>
+        <w:t>J Affect Disord</w:t>
+      </w:r>
+      <w:r>
+        <w:t>. 2024;349:534-540. doi:10.1016/j.jad.2024.01.066</w:t>
       </w:r>
     </w:p>
     <w:p>

</xml_diff>

<commit_message>
Complete AMA details for World Bank and Shahzad references
Co-Authored-By: Claude Opus 5.5 <noreply@anthropic.com>
Claude-Session: https://claude.ai/code/session_01VkRRDHxfMApHVBQgQibkFd
</commit_message>
<xml_diff>
--- a/PMDD_Scoping_Review/PMDD_Poster_References_AMA.docx
+++ b/PMDD_Scoping_Review/PMDD_Poster_References_AMA.docx
@@ -285,7 +285,7 @@
         <w:tab/>
       </w:r>
       <w:r>
-        <w:t>World Bank. World Bank country classifications by income level for FY2027. Published July 1, 2026. Accessed September 30, 2026. https://datahelpdesk.worldbank.org/knowledgebase/articles/906519-world-bank-country-and-lending-groups</w:t>
+        <w:t>World Bank. World Bank country classifications by income level for FY2027. World Bank Data Help Desk. Published July 1, 2026. Accessed September 30, 2026. https://datahelpdesk.worldbank.org/knowledgebase/articles/906519-world-bank-country-and-lending-groups</w:t>
       </w:r>
     </w:p>
     <w:p>
@@ -1107,7 +1107,7 @@
         <w:t>J Pak Med Assoc</w:t>
       </w:r>
       <w:r>
-        <w:t>. 2025. PMID:40269394</w:t>
+        <w:t>. Published online March 1, 2025. doi:10.47391/JPMA.20466</w:t>
       </w:r>
     </w:p>
     <w:p>

</xml_diff>